<commit_message>
update rgpd pci dss
</commit_message>
<xml_diff>
--- a/documentation/5 - Plan_de_securite.docx
+++ b/documentation/5 - Plan_de_securite.docx
@@ -3922,7 +3922,7 @@
     </w:p>
     <w:p>
       <w:r>
-        <w:t>La création Checkout relit prix et produits côté serveur. La carte bancaire reste dans les surfaces Stripe ; CYNA ne stocke que marque et quatre derniers chiffres lorsqu'ils sont disponibles. Le webhook refuse toute signature manquante ou invalide avant d'instancier une écriture privilégiée. Les événements valides en erreur répondent 500 afin d'obtenir un retry.</w:t>
+        <w:t>La création Checkout relit prix et produits côté serveur. PCI DSS s'applique aux acteurs qui stockent, traitent ou transmettent des données de carte. CYNA utilise Stripe Checkout afin que le numéro complet de carte et le cryptogramme soient collectés directement par Stripe et ne soient enregistrés ni dans Supabase, ni dans les logs, Sentry ou les tickets. Seuls les identifiants Stripe nécessaires à la réconciliation et, lorsqu'ils sont fournis, la marque et les quatre derniers chiffres peuvent être conservés. La documentation Stripe indique que Stripe est évalué comme prestataire PCI DSS de niveau 1, mais cela ne certifie pas CYNA. L'équipe reste responsable de la configuration de l'intégration, de la protection des clés, de la vérification des webhooks et de l'attestation éventuellement applicable. Le webhook refuse toute signature manquante ou invalide avant d'instancier une écriture privilégiée. Les événements valides en erreur répondent 500 afin d'obtenir un retry.</w:t>
       </w:r>
     </w:p>
     <w:p>
@@ -4944,7 +4944,7 @@
     </w:p>
     <w:p>
       <w:r>
-        <w:t>CYNA doit tenir un registre des traitements, contractualiser les sous-traitants, préciser les transferts éventuels et publier une information utilisateur cohérente. Une demande d'accès ou d'effacement doit rechercher les données Supabase, Storage et, selon la fenêtre, Sentry. Les données soumises aux obligations de facturation peuvent devoir être conservées ou pseudonymisées plutôt qu'effacées.</w:t>
+        <w:t>CYNA doit tenir un registre des traitements, préciser les finalités et bases légales, contractualiser les sous-traitants, documenter les durées de conservation et publier une information utilisateur cohérente. Le principe RGPD de minimisation impose de ne collecter et conserver que les données adéquates, pertinentes et nécessaires à chaque finalité. Une donnée personnelle ne doit pas être conservée par simple commodité lorsqu'un identifiant technique, un hash ou une donnée agrégée suffit. Une personne peut demander confirmation des traitements et accès à ses données. La demande est suivie dans le support sous la catégorie dédiée data_access dès son activation, avec une vérification d'identité proportionnée et sans demander de mot de passe, de code MFA ou de numéro de carte. La réponse doit intervenir dans le délai légal applicable, en principe un mois pour une demande simple. La recherche couvre les données Supabase, Storage et les données encore disponibles chez les fournisseurs concernés. Les données soumises aux obligations de facturation ou aux droits de tiers peuvent devoir être conservées, limitées ou pseudonymisées plutôt qu'effacées. Le ticket trace la demande et sa clôture, sans dupliquer inutilement toutes les données remises.</w:t>
       </w:r>
     </w:p>
     <w:p>

</xml_diff>